<commit_message>
Ethical Review docs updated
Updates to Consent Form doc & Procedure and Debrief doc
</commit_message>
<xml_diff>
--- a/memory/ethics/Consent Form.docx
+++ b/memory/ethics/Consent Form.docx
@@ -4,11 +4,30 @@
   <w:body>
     <w:p>
       <w:r>
+        <w:rPr>
+          <w:noProof/>
+        </w:rPr>
         <w:drawing>
-          <wp:inline distT="0" distB="0" distL="0" distR="0" wp14:anchorId="343241B9" wp14:editId="25FC3B75">
-            <wp:extent cx="9110136" cy="5305702"/>
+          <wp:anchor distT="0" distB="0" distL="114300" distR="114300" simplePos="0" relativeHeight="251658240" behindDoc="1" locked="0" layoutInCell="1" allowOverlap="1" wp14:anchorId="343241B9" wp14:editId="416F7D87">
+            <wp:simplePos x="0" y="0"/>
+            <wp:positionH relativeFrom="margin">
+              <wp:align>center</wp:align>
+            </wp:positionH>
+            <wp:positionV relativeFrom="margin">
+              <wp:posOffset>-635</wp:posOffset>
+            </wp:positionV>
+            <wp:extent cx="10123170" cy="5895975"/>
             <wp:effectExtent l="0" t="0" r="0" b="9525"/>
-            <wp:docPr id="844535142" name="Picture 1" descr="A close up of a document&#10;&#10;AI-generated content may be incorrect."/>
+            <wp:wrapTight wrapText="bothSides">
+              <wp:wrapPolygon edited="0">
+                <wp:start x="0" y="0"/>
+                <wp:lineTo x="0" y="21565"/>
+                <wp:lineTo x="21543" y="21565"/>
+                <wp:lineTo x="21543" y="0"/>
+                <wp:lineTo x="0" y="0"/>
+              </wp:wrapPolygon>
+            </wp:wrapTight>
+            <wp:docPr id="844535142" name="Picture 1"/>
             <wp:cNvGraphicFramePr>
               <a:graphicFrameLocks xmlns:a="http://schemas.openxmlformats.org/drawingml/2006/main" noChangeAspect="1"/>
             </wp:cNvGraphicFramePr>
@@ -16,12 +35,18 @@
               <a:graphicData uri="http://schemas.openxmlformats.org/drawingml/2006/picture">
                 <pic:pic xmlns:pic="http://schemas.openxmlformats.org/drawingml/2006/picture">
                   <pic:nvPicPr>
-                    <pic:cNvPr id="844535142" name="Picture 1" descr="A close up of a document&#10;&#10;AI-generated content may be incorrect."/>
+                    <pic:cNvPr id="844535142" name="Picture 1"/>
                     <pic:cNvPicPr/>
                   </pic:nvPicPr>
-                  <pic:blipFill rotWithShape="1">
-                    <a:blip r:embed="rId4"/>
-                    <a:srcRect l="4528"/>
+                  <pic:blipFill>
+                    <a:blip r:embed="rId4">
+                      <a:extLst>
+                        <a:ext uri="{28A0092B-C50C-407E-A947-70E740481C1C}">
+                          <a14:useLocalDpi xmlns:a14="http://schemas.microsoft.com/office/drawing/2010/main" val="0"/>
+                        </a:ext>
+                      </a:extLst>
+                    </a:blip>
+                    <a:srcRect l="934" r="934"/>
                     <a:stretch>
                       <a:fillRect/>
                     </a:stretch>
@@ -29,7 +54,7 @@
                   <pic:spPr bwMode="auto">
                     <a:xfrm>
                       <a:off x="0" y="0"/>
-                      <a:ext cx="9143375" cy="5325060"/>
+                      <a:ext cx="10123170" cy="5895975"/>
                     </a:xfrm>
                     <a:prstGeom prst="rect">
                       <a:avLst/>
@@ -46,7 +71,13 @@
                 </pic:pic>
               </a:graphicData>
             </a:graphic>
-          </wp:inline>
+            <wp14:sizeRelH relativeFrom="margin">
+              <wp14:pctWidth>0</wp14:pctWidth>
+            </wp14:sizeRelH>
+            <wp14:sizeRelV relativeFrom="margin">
+              <wp14:pctHeight>0</wp14:pctHeight>
+            </wp14:sizeRelV>
+          </wp:anchor>
         </w:drawing>
       </w:r>
     </w:p>

</xml_diff>